<commit_message>
fix: cambio en documento 6
</commit_message>
<xml_diff>
--- a/document/6_prorroga_6_meses.docx
+++ b/document/6_prorroga_6_meses.docx
@@ -20,7 +20,13 @@
         <w:rPr>
           <w:rFonts w:ascii="Helvetica" w:hAnsi="Helvetica" w:cs="Segoe UI"/>
         </w:rPr>
-        <w:t>a Junta Directiva</w:t>
+        <w:t xml:space="preserve">a </w:t>
+      </w:r>
+      <w:r>
+        <w:rPr>
+          <w:rFonts w:ascii="Helvetica" w:hAnsi="Helvetica" w:cs="Segoe UI"/>
+        </w:rPr>
+        <w:t>UPS</w:t>
       </w:r>
     </w:p>
     <w:p>
@@ -285,7 +291,7 @@
           <w:sz w:val="22"/>
           <w:szCs w:val="22"/>
         </w:rPr>
-        <w:t>Sres. Miembros de Junta Directiva</w:t>
+        <w:t>Lic. Ever Antonio Padilla Lazo.</w:t>
       </w:r>
     </w:p>
     <w:p>

</xml_diff>